<commit_message>
feat: import EAS assets table from Excel per service
Each service header in the ЄАС report gets an import button that reuses the
existing column-mapping dialog. EASAssetData is annotated with [ImportColumn]
so the mappable columns derive from the model itself, and EASAssetsImportStrategy
returns rows to the caller instead of persisting them, mirroring
ValuationImportStrategy. Importing replaces the service's existing rows.

Also renames ImportColumnAttribute's misspelled isReqired parameter, drops the
serial-number column from EAS assets and the template, shortens the serial-number
label in ReportHelper, and relaxes service save gating to the SetDefault action.

Co-Authored-By: Claude Opus 5 <noreply@anthropic.com>
</commit_message>
<xml_diff>
--- a/Mil.Paperwork.Domain/Templates/EASTemplate.docx
+++ b/Mil.Paperwork.Domain/Templates/EASTemplate.docx
@@ -5967,53 +5967,6 @@
           <w:lang w:val="ru-RU" w:eastAsia="en-US"/>
         </w:rPr>
         <w:fldChar w:fldCharType="end"/>
-      </w:r>
-      <w:r>
-        <w:rPr>
-          <w:sz w:val="24"/>
-          <w:szCs w:val="24"/>
-        </w:rPr>
-        <w:t xml:space="preserve"> </w:t>
-      </w:r>
-      <w:r>
-        <w:rPr>
-          <w:sz w:val="24"/>
-          <w:szCs w:val="24"/>
-          <w:highlight w:val="yellow"/>
-        </w:rPr>
-        <w:t>старший солдат РЕМХА Тарас Юрійович, снайпер (2 категорії)-розвідник розвідувального відділення 3 розвідувального взводу 1 розвідувальної роти</w:t>
-      </w:r>
-      <w:r>
-        <w:rPr>
-          <w:sz w:val="24"/>
-          <w:szCs w:val="24"/>
-          <w:highlight w:val="yellow"/>
-        </w:rPr>
-        <w:t xml:space="preserve"> військової частини А4682</w:t>
-      </w:r>
-      <w:r>
-        <w:rPr>
-          <w:sz w:val="24"/>
-          <w:szCs w:val="24"/>
-          <w:highlight w:val="yellow"/>
-        </w:rPr>
-        <w:t>; рядовий, ФАТ</w:t>
-      </w:r>
-      <w:r>
-        <w:rPr>
-          <w:sz w:val="24"/>
-          <w:szCs w:val="24"/>
-          <w:highlight w:val="yellow"/>
-        </w:rPr>
-        <w:t>Е</w:t>
-      </w:r>
-      <w:r>
-        <w:rPr>
-          <w:sz w:val="24"/>
-          <w:szCs w:val="24"/>
-          <w:highlight w:val="yellow"/>
-        </w:rPr>
-        <w:t>НКО Володимир Миколайович, навідник - оператор 2 розвідувального відділення 3 розвідувального взводу 1 розвідувальної роти військової частини А4682; старший солдат СКРИПНИК Валерій Олександрович, навідник - оператор 3 розвідувального відділення 2 розвідувального взводу 1 розвідувальної роти військової частини А4682</w:t>
       </w:r>
       <w:r>
         <w:rPr>

</xml_diff>

<commit_message>
chore: update EAS template
Co-Authored-By: Claude Opus 5 <noreply@anthropic.com>
</commit_message>
<xml_diff>
--- a/Mil.Paperwork.Domain/Templates/EASTemplate.docx
+++ b/Mil.Paperwork.Domain/Templates/EASTemplate.docx
@@ -7187,323 +7187,61 @@
       <w:pPr>
         <w:keepNext/>
         <w:keepLines/>
-        <w:jc w:val="both"/>
-        <w:rPr>
-          <w:sz w:val="22"/>
-          <w:szCs w:val="22"/>
-          <w:lang w:val="en-US"/>
-        </w:rPr>
-      </w:pPr>
-      <w:r>
-        <w:rPr>
-          <w:color w:val="000000"/>
-          <w:sz w:val="24"/>
-          <w:szCs w:val="24"/>
-          <w:lang w:val="ru-RU" w:eastAsia="en-US"/>
-        </w:rPr>
-        <w:fldChar w:fldCharType="begin"/>
-      </w:r>
-      <w:r>
-        <w:rPr>
-          <w:color w:val="000000"/>
-          <w:sz w:val="24"/>
-          <w:szCs w:val="24"/>
-          <w:lang w:val="ru-RU" w:eastAsia="en-US"/>
-        </w:rPr>
-        <w:instrText xml:space="preserve"> MERGEFIELD  EVENT_WITNESSES_BLOCK  \* MERGEFORMAT </w:instrText>
-      </w:r>
-      <w:r>
-        <w:rPr>
-          <w:color w:val="000000"/>
-          <w:sz w:val="24"/>
-          <w:szCs w:val="24"/>
-          <w:lang w:val="ru-RU" w:eastAsia="en-US"/>
-        </w:rPr>
-        <w:fldChar w:fldCharType="separate"/>
-      </w:r>
-      <w:r>
-        <w:rPr>
-          <w:noProof/>
-          <w:color w:val="000000"/>
-          <w:sz w:val="24"/>
-          <w:szCs w:val="24"/>
-          <w:lang w:val="ru-RU" w:eastAsia="en-US"/>
-        </w:rPr>
-        <w:t>«EVENT_WITNESSES_BLOCK»</w:t>
-      </w:r>
-      <w:r>
-        <w:rPr>
-          <w:color w:val="000000"/>
-          <w:sz w:val="24"/>
-          <w:szCs w:val="24"/>
-          <w:lang w:val="ru-RU" w:eastAsia="en-US"/>
-        </w:rPr>
-        <w:fldChar w:fldCharType="end"/>
-      </w:r>
-    </w:p>
-    <w:p>
-      <w:pPr>
-        <w:tabs>
-          <w:tab w:val="right" w:pos="14570"/>
-        </w:tabs>
-        <w:jc w:val="both"/>
-        <w:rPr>
-          <w:sz w:val="24"/>
-          <w:szCs w:val="24"/>
-          <w:highlight w:val="yellow"/>
-        </w:rPr>
-      </w:pPr>
-      <w:r>
-        <w:rPr>
-          <w:sz w:val="24"/>
-          <w:szCs w:val="24"/>
-          <w:highlight w:val="yellow"/>
-        </w:rPr>
-        <w:t>Снайпер (2 категорії) - розвідник 2 розвідувального відділення 1 розвідувального взводу 2 розвідувальної роти</w:t>
-      </w:r>
-    </w:p>
-    <w:p>
-      <w:pPr>
         <w:tabs>
           <w:tab w:val="right" w:pos="15136"/>
         </w:tabs>
         <w:jc w:val="both"/>
         <w:rPr>
-          <w:sz w:val="24"/>
-          <w:szCs w:val="24"/>
-          <w:highlight w:val="yellow"/>
-        </w:rPr>
-      </w:pPr>
-      <w:r>
-        <w:rPr>
-          <w:sz w:val="24"/>
-          <w:szCs w:val="24"/>
-          <w:highlight w:val="yellow"/>
-        </w:rPr>
-        <w:t>військової частини А4682</w:t>
-      </w:r>
-      <w:r>
-        <w:rPr>
-          <w:sz w:val="24"/>
-          <w:szCs w:val="24"/>
-          <w:highlight w:val="yellow"/>
-        </w:rPr>
-        <w:t>,</w:t>
-      </w:r>
-      <w:r>
-        <w:rPr>
-          <w:sz w:val="24"/>
-          <w:szCs w:val="24"/>
-          <w:highlight w:val="yellow"/>
-        </w:rPr>
-        <w:t xml:space="preserve"> </w:t>
-      </w:r>
-      <w:r>
-        <w:rPr>
-          <w:sz w:val="24"/>
-          <w:szCs w:val="24"/>
-          <w:highlight w:val="yellow"/>
-        </w:rPr>
-        <w:t xml:space="preserve">старший </w:t>
-      </w:r>
-      <w:r>
-        <w:rPr>
-          <w:sz w:val="24"/>
-          <w:szCs w:val="24"/>
-          <w:highlight w:val="yellow"/>
-        </w:rPr>
-        <w:t>солдат</w:t>
-      </w:r>
-      <w:r>
-        <w:rPr>
-          <w:sz w:val="24"/>
-          <w:szCs w:val="24"/>
-          <w:highlight w:val="yellow"/>
-        </w:rPr>
-        <w:tab/>
-      </w:r>
-      <w:r>
-        <w:rPr>
-          <w:sz w:val="24"/>
-          <w:szCs w:val="24"/>
-          <w:highlight w:val="yellow"/>
-        </w:rPr>
-        <w:t>Тарас РЕМХА</w:t>
-      </w:r>
-    </w:p>
-    <w:p>
-      <w:pPr>
-        <w:tabs>
-          <w:tab w:val="right" w:pos="15136"/>
-        </w:tabs>
-        <w:jc w:val="both"/>
-        <w:rPr>
-          <w:sz w:val="24"/>
-          <w:szCs w:val="24"/>
-          <w:highlight w:val="yellow"/>
-        </w:rPr>
-      </w:pPr>
-      <w:r>
-        <w:rPr>
-          <w:sz w:val="24"/>
-          <w:szCs w:val="24"/>
-          <w:highlight w:val="yellow"/>
-        </w:rPr>
-        <w:t>Старший розвідник-</w:t>
-      </w:r>
-      <w:proofErr w:type="spellStart"/>
-      <w:r>
-        <w:rPr>
-          <w:sz w:val="24"/>
-          <w:szCs w:val="24"/>
-          <w:highlight w:val="yellow"/>
-        </w:rPr>
-        <w:t>радіотелефоніст</w:t>
-      </w:r>
-      <w:proofErr w:type="spellEnd"/>
-      <w:r>
-        <w:rPr>
-          <w:sz w:val="24"/>
-          <w:szCs w:val="24"/>
-          <w:highlight w:val="yellow"/>
-        </w:rPr>
-        <w:t xml:space="preserve"> 1 розвідувального відділення 3 розвідувального взводу 2 розвідувальної роти</w:t>
-      </w:r>
-    </w:p>
-    <w:p>
-      <w:pPr>
-        <w:tabs>
-          <w:tab w:val="right" w:pos="15136"/>
-        </w:tabs>
-        <w:jc w:val="both"/>
-        <w:rPr>
-          <w:sz w:val="24"/>
-          <w:szCs w:val="24"/>
-          <w:highlight w:val="yellow"/>
-        </w:rPr>
-      </w:pPr>
-      <w:r>
-        <w:rPr>
-          <w:sz w:val="24"/>
-          <w:szCs w:val="24"/>
-          <w:highlight w:val="yellow"/>
-        </w:rPr>
-        <w:t xml:space="preserve">військової частини А4682, </w:t>
-      </w:r>
-      <w:r>
-        <w:rPr>
-          <w:sz w:val="24"/>
-          <w:szCs w:val="24"/>
-          <w:highlight w:val="yellow"/>
-        </w:rPr>
-        <w:t>старший солдат</w:t>
-      </w:r>
-      <w:r>
-        <w:rPr>
-          <w:sz w:val="24"/>
-          <w:szCs w:val="24"/>
-          <w:highlight w:val="yellow"/>
-        </w:rPr>
-        <w:tab/>
-      </w:r>
-      <w:r>
-        <w:rPr>
-          <w:sz w:val="24"/>
-          <w:szCs w:val="24"/>
-          <w:highlight w:val="yellow"/>
-        </w:rPr>
-        <w:t>Володимир ФАТЕНКО</w:t>
-      </w:r>
-    </w:p>
-    <w:p>
-      <w:pPr>
-        <w:tabs>
-          <w:tab w:val="right" w:pos="15136"/>
-        </w:tabs>
-        <w:jc w:val="both"/>
-        <w:rPr>
-          <w:sz w:val="24"/>
-          <w:szCs w:val="24"/>
-          <w:highlight w:val="yellow"/>
-        </w:rPr>
-      </w:pPr>
-      <w:r>
-        <w:rPr>
-          <w:sz w:val="24"/>
-          <w:szCs w:val="24"/>
-          <w:highlight w:val="yellow"/>
-        </w:rPr>
-        <w:t>Старший розвідник-</w:t>
-      </w:r>
-      <w:proofErr w:type="spellStart"/>
-      <w:r>
-        <w:rPr>
-          <w:sz w:val="24"/>
-          <w:szCs w:val="24"/>
-          <w:highlight w:val="yellow"/>
-        </w:rPr>
-        <w:t>радіотелефоніст</w:t>
-      </w:r>
-      <w:proofErr w:type="spellEnd"/>
-      <w:r>
-        <w:rPr>
-          <w:sz w:val="24"/>
-          <w:szCs w:val="24"/>
-          <w:highlight w:val="yellow"/>
-        </w:rPr>
-        <w:t xml:space="preserve"> 3 розвідувального відділення 3 розвідувального взводу 2 розвідувальної роти</w:t>
-      </w:r>
-    </w:p>
-    <w:p>
-      <w:pPr>
-        <w:tabs>
-          <w:tab w:val="right" w:pos="15136"/>
-        </w:tabs>
-        <w:jc w:val="both"/>
-        <w:rPr>
-          <w:sz w:val="24"/>
-          <w:szCs w:val="24"/>
-        </w:rPr>
-      </w:pPr>
-      <w:r>
-        <w:rPr>
-          <w:sz w:val="24"/>
-          <w:szCs w:val="24"/>
-          <w:highlight w:val="yellow"/>
-        </w:rPr>
-        <w:t xml:space="preserve">військової частини А4682, </w:t>
-      </w:r>
-      <w:r>
-        <w:rPr>
-          <w:sz w:val="24"/>
-          <w:szCs w:val="24"/>
-          <w:highlight w:val="yellow"/>
-        </w:rPr>
-        <w:t xml:space="preserve">старший </w:t>
-      </w:r>
-      <w:r>
-        <w:rPr>
-          <w:sz w:val="24"/>
-          <w:szCs w:val="24"/>
-          <w:highlight w:val="yellow"/>
-        </w:rPr>
-        <w:t>солдат</w:t>
-      </w:r>
-      <w:r>
-        <w:rPr>
-          <w:sz w:val="24"/>
-          <w:szCs w:val="24"/>
-          <w:highlight w:val="yellow"/>
-        </w:rPr>
-        <w:tab/>
-      </w:r>
-      <w:r>
-        <w:rPr>
-          <w:sz w:val="24"/>
-          <w:szCs w:val="24"/>
-          <w:highlight w:val="yellow"/>
-        </w:rPr>
-        <w:t>Валерій СКРИПНИК</w:t>
+          <w:sz w:val="22"/>
+          <w:szCs w:val="22"/>
+          <w:lang w:val="en-US"/>
+        </w:rPr>
+      </w:pPr>
+      <w:r>
+        <w:rPr>
+          <w:color w:val="000000"/>
+          <w:sz w:val="24"/>
+          <w:szCs w:val="24"/>
+          <w:lang w:val="ru-RU" w:eastAsia="en-US"/>
+        </w:rPr>
+        <w:fldChar w:fldCharType="begin"/>
+      </w:r>
+      <w:r>
+        <w:rPr>
+          <w:color w:val="000000"/>
+          <w:sz w:val="24"/>
+          <w:szCs w:val="24"/>
+          <w:lang w:val="ru-RU" w:eastAsia="en-US"/>
+        </w:rPr>
+        <w:instrText xml:space="preserve"> MERGEFIELD  EVENT_WITNESSES_BLOCK  \* MERGEFORMAT </w:instrText>
+      </w:r>
+      <w:r>
+        <w:rPr>
+          <w:color w:val="000000"/>
+          <w:sz w:val="24"/>
+          <w:szCs w:val="24"/>
+          <w:lang w:val="ru-RU" w:eastAsia="en-US"/>
+        </w:rPr>
+        <w:fldChar w:fldCharType="separate"/>
+      </w:r>
+      <w:r>
+        <w:rPr>
+          <w:noProof/>
+          <w:color w:val="000000"/>
+          <w:sz w:val="24"/>
+          <w:szCs w:val="24"/>
+          <w:lang w:val="ru-RU" w:eastAsia="en-US"/>
+        </w:rPr>
+        <w:t>«EVENT_WITNESSES_BLOCK»</w:t>
+      </w:r>
+      <w:r>
+        <w:rPr>
+          <w:color w:val="000000"/>
+          <w:sz w:val="24"/>
+          <w:szCs w:val="24"/>
+          <w:lang w:val="ru-RU" w:eastAsia="en-US"/>
+        </w:rPr>
+        <w:fldChar w:fldCharType="end"/>
       </w:r>
     </w:p>
     <w:p>
@@ -7583,7 +7321,7 @@
           <w:b/>
           <w:sz w:val="24"/>
           <w:szCs w:val="24"/>
-          <w:lang w:val="ru-RU"/>
+          <w:lang w:val="en-US"/>
         </w:rPr>
       </w:pPr>
       <w:r>
@@ -7631,293 +7369,6 @@
           <w:lang w:val="ru-RU"/>
         </w:rPr>
         <w:fldChar w:fldCharType="end"/>
-      </w:r>
-    </w:p>
-    <w:p>
-      <w:pPr>
-        <w:tabs>
-          <w:tab w:val="right" w:pos="15136"/>
-        </w:tabs>
-        <w:jc w:val="both"/>
-        <w:rPr>
-          <w:sz w:val="24"/>
-          <w:szCs w:val="24"/>
-          <w:highlight w:val="yellow"/>
-        </w:rPr>
-      </w:pPr>
-      <w:r>
-        <w:rPr>
-          <w:sz w:val="24"/>
-          <w:szCs w:val="24"/>
-          <w:highlight w:val="yellow"/>
-        </w:rPr>
-        <w:t>Начальник групи зв’язку</w:t>
-      </w:r>
-      <w:r>
-        <w:rPr>
-          <w:sz w:val="24"/>
-          <w:szCs w:val="24"/>
-          <w:highlight w:val="yellow"/>
-        </w:rPr>
-        <w:t xml:space="preserve"> та кібербезпеки</w:t>
-      </w:r>
-      <w:r>
-        <w:rPr>
-          <w:sz w:val="24"/>
-          <w:szCs w:val="24"/>
-          <w:highlight w:val="yellow"/>
-        </w:rPr>
-        <w:t xml:space="preserve"> – начальник зв’язку</w:t>
-      </w:r>
-      <w:r>
-        <w:rPr>
-          <w:sz w:val="24"/>
-          <w:szCs w:val="24"/>
-          <w:highlight w:val="yellow"/>
-        </w:rPr>
-        <w:t xml:space="preserve"> військової частини А4682</w:t>
-      </w:r>
-      <w:r>
-        <w:rPr>
-          <w:sz w:val="24"/>
-          <w:szCs w:val="24"/>
-          <w:highlight w:val="yellow"/>
-        </w:rPr>
-        <w:t xml:space="preserve">, </w:t>
-      </w:r>
-    </w:p>
-    <w:p>
-      <w:pPr>
-        <w:tabs>
-          <w:tab w:val="right" w:pos="15136"/>
-        </w:tabs>
-        <w:jc w:val="both"/>
-        <w:rPr>
-          <w:sz w:val="24"/>
-          <w:szCs w:val="24"/>
-          <w:highlight w:val="yellow"/>
-        </w:rPr>
-      </w:pPr>
-      <w:r>
-        <w:rPr>
-          <w:sz w:val="24"/>
-          <w:szCs w:val="24"/>
-          <w:highlight w:val="yellow"/>
-        </w:rPr>
-        <w:t>старший лейтенант</w:t>
-      </w:r>
-      <w:r>
-        <w:rPr>
-          <w:sz w:val="24"/>
-          <w:szCs w:val="24"/>
-          <w:highlight w:val="yellow"/>
-        </w:rPr>
-        <w:tab/>
-      </w:r>
-      <w:proofErr w:type="spellStart"/>
-      <w:r>
-        <w:rPr>
-          <w:sz w:val="24"/>
-          <w:szCs w:val="24"/>
-          <w:highlight w:val="yellow"/>
-        </w:rPr>
-        <w:t>Олександр</w:t>
-      </w:r>
-      <w:r>
-        <w:rPr>
-          <w:sz w:val="24"/>
-          <w:szCs w:val="24"/>
-          <w:highlight w:val="yellow"/>
-        </w:rPr>
-        <w:t>В</w:t>
-      </w:r>
-      <w:proofErr w:type="spellEnd"/>
-      <w:r>
-        <w:rPr>
-          <w:sz w:val="24"/>
-          <w:szCs w:val="24"/>
-          <w:highlight w:val="yellow"/>
-        </w:rPr>
-        <w:t xml:space="preserve"> ШУПЕР</w:t>
-      </w:r>
-    </w:p>
-    <w:p>
-      <w:pPr>
-        <w:tabs>
-          <w:tab w:val="right" w:pos="15136"/>
-        </w:tabs>
-        <w:jc w:val="both"/>
-        <w:rPr>
-          <w:sz w:val="24"/>
-          <w:szCs w:val="24"/>
-          <w:highlight w:val="yellow"/>
-        </w:rPr>
-      </w:pPr>
-      <w:r>
-        <w:rPr>
-          <w:sz w:val="24"/>
-          <w:szCs w:val="24"/>
-          <w:highlight w:val="yellow"/>
-        </w:rPr>
-        <w:t>Начальник речової служби</w:t>
-      </w:r>
-      <w:r>
-        <w:rPr>
-          <w:sz w:val="24"/>
-          <w:szCs w:val="24"/>
-          <w:highlight w:val="yellow"/>
-        </w:rPr>
-        <w:t xml:space="preserve"> військової частини А4682</w:t>
-      </w:r>
-    </w:p>
-    <w:p>
-      <w:pPr>
-        <w:tabs>
-          <w:tab w:val="right" w:pos="15136"/>
-        </w:tabs>
-        <w:jc w:val="both"/>
-        <w:rPr>
-          <w:sz w:val="24"/>
-          <w:szCs w:val="24"/>
-          <w:highlight w:val="yellow"/>
-        </w:rPr>
-      </w:pPr>
-      <w:r>
-        <w:rPr>
-          <w:sz w:val="24"/>
-          <w:szCs w:val="24"/>
-          <w:highlight w:val="yellow"/>
-        </w:rPr>
-        <w:t>сержант</w:t>
-      </w:r>
-      <w:r>
-        <w:rPr>
-          <w:sz w:val="24"/>
-          <w:szCs w:val="24"/>
-          <w:highlight w:val="yellow"/>
-        </w:rPr>
-        <w:tab/>
-      </w:r>
-      <w:r>
-        <w:rPr>
-          <w:sz w:val="24"/>
-          <w:szCs w:val="24"/>
-          <w:highlight w:val="yellow"/>
-        </w:rPr>
-        <w:t>Тетяна-Анна</w:t>
-      </w:r>
-      <w:r>
-        <w:rPr>
-          <w:sz w:val="24"/>
-          <w:szCs w:val="24"/>
-          <w:highlight w:val="yellow"/>
-        </w:rPr>
-        <w:t xml:space="preserve"> </w:t>
-      </w:r>
-      <w:r>
-        <w:rPr>
-          <w:sz w:val="24"/>
-          <w:szCs w:val="24"/>
-          <w:highlight w:val="yellow"/>
-        </w:rPr>
-        <w:t>КОРОБКА</w:t>
-      </w:r>
-    </w:p>
-    <w:p>
-      <w:pPr>
-        <w:tabs>
-          <w:tab w:val="right" w:pos="15136"/>
-        </w:tabs>
-        <w:jc w:val="both"/>
-        <w:rPr>
-          <w:sz w:val="24"/>
-          <w:szCs w:val="24"/>
-          <w:highlight w:val="yellow"/>
-        </w:rPr>
-      </w:pPr>
-      <w:r>
-        <w:rPr>
-          <w:sz w:val="24"/>
-          <w:szCs w:val="24"/>
-          <w:highlight w:val="yellow"/>
-        </w:rPr>
-        <w:t>Тимчасово виконуючий обов’язки н</w:t>
-      </w:r>
-      <w:r>
-        <w:rPr>
-          <w:sz w:val="24"/>
-          <w:szCs w:val="24"/>
-          <w:highlight w:val="yellow"/>
-        </w:rPr>
-        <w:t>ачальник</w:t>
-      </w:r>
-      <w:r>
-        <w:rPr>
-          <w:sz w:val="24"/>
-          <w:szCs w:val="24"/>
-          <w:highlight w:val="yellow"/>
-        </w:rPr>
-        <w:t>а інженерної</w:t>
-      </w:r>
-      <w:r>
-        <w:rPr>
-          <w:sz w:val="24"/>
-          <w:szCs w:val="24"/>
-          <w:highlight w:val="yellow"/>
-        </w:rPr>
-        <w:t xml:space="preserve"> служби</w:t>
-      </w:r>
-      <w:r>
-        <w:rPr>
-          <w:sz w:val="24"/>
-          <w:szCs w:val="24"/>
-          <w:highlight w:val="yellow"/>
-        </w:rPr>
-        <w:t xml:space="preserve"> </w:t>
-      </w:r>
-      <w:r>
-        <w:rPr>
-          <w:sz w:val="24"/>
-          <w:szCs w:val="24"/>
-          <w:highlight w:val="yellow"/>
-        </w:rPr>
-        <w:t>військової частини А4682</w:t>
-      </w:r>
-    </w:p>
-    <w:p>
-      <w:pPr>
-        <w:tabs>
-          <w:tab w:val="right" w:pos="15136"/>
-        </w:tabs>
-        <w:jc w:val="both"/>
-        <w:rPr>
-          <w:sz w:val="24"/>
-          <w:szCs w:val="24"/>
-        </w:rPr>
-      </w:pPr>
-      <w:r>
-        <w:rPr>
-          <w:sz w:val="24"/>
-          <w:szCs w:val="24"/>
-          <w:highlight w:val="yellow"/>
-        </w:rPr>
-        <w:t>старший лейтенант</w:t>
-      </w:r>
-      <w:r>
-        <w:rPr>
-          <w:sz w:val="24"/>
-          <w:szCs w:val="24"/>
-          <w:highlight w:val="yellow"/>
-        </w:rPr>
-        <w:tab/>
-      </w:r>
-      <w:r>
-        <w:rPr>
-          <w:sz w:val="24"/>
-          <w:szCs w:val="24"/>
-          <w:highlight w:val="yellow"/>
-        </w:rPr>
-        <w:t>Олександр БЕРЕЗЮК</w:t>
       </w:r>
     </w:p>
     <w:p>

</xml_diff>